<commit_message>
feat(catering-es-2.0): F2 cerrada — los 11 entregables 2.2 en dl/ y gates D12 en verde
- plan financiero (motor de línea A, molde A-β) y checklist (82 tareas) desde el dry-run TODO VERDE
- plan de negocio docx (131 ranuras, 10 H1, A4, 7.426 palabras, 0 tokens sin resolver) y calculadora
  (autotest pycel 168/168)
- D9: 23 arreglos de texto en los otros 7 ficheros (freelance, «validado España 2026», research,
  inversión, RGSEAA, IVA de servicios asociados, estado de proveedores)
- docx p43 (plantilla 3 fijos + 8 fijos discontinuos = {PLANTILLA_PERSONAS}) y p48 (mezcla redondeada
  con prudencia, IVA incluido); gate de cifras prohibidas afinado (2.200 € de seguros es legítimo)
- regresión 5 planes de línea A = 0 diferencias · censo 0 · no latinos 0 · barrido prohibidos 0
- F2-NOTAS.md §6: cierre de la F2

Via: Claude Code

Co-Authored-By: Claude Opus 5.5 <noreply@anthropic.com>
Claude-Session: https://claude.ai/code/session_01KriAdpMP6uaswtiVvqtBvP
</commit_message>
<xml_diff>
--- a/astro-site/public/dl/plan-catering-tematico-eventos/catalogo-equipamiento-multi-cocina-catering-tematico.docx
+++ b/astro-site/public/dl/plan-catering-tematico-eventos/catalogo-equipamiento-multi-cocina-catering-tematico.docx
@@ -39,7 +39,7 @@
           <w:color w:val="C4974A"/>
           <w:sz w:val="24"/>
         </w:rPr>
-        <w:t>Marcas y modelos validados España 2026</w:t>
+        <w:t>Marcas y modelos de referencia · edición 2026</w:t>
       </w:r>
     </w:p>
     <w:p>
@@ -75,7 +75,7 @@
         <w:spacing w:after="120"/>
       </w:pPr>
       <w:r>
-        <w:t>El equipamiento del catering temático multi-concepto es la inversión más compleja del modelo. A diferencia de un monoproducto (paellero, parrillero), aquí necesitas equipamiento especializado por cada cocina del mundo que ofrezcas. La estrategia recomendada es empezar con 1-2 conceptos dominados (ej. sushi-bar + pizza al horno de leña) y añadir 1-2/año, amortizando inversión progresivamente.</w:t>
+        <w:t>El equipamiento del catering temático multi-concepto es la inversión más compleja del modelo. A diferencia de un monoproducto (paellero, parrillero), aquí necesitas equipamiento especializado para cada estación temática que vendas (empieza por dos o tres, no por todas). La estrategia recomendada es empezar con 1-2 conceptos dominados (ej. sushi-bar + pizza al horno de leña) y añadir 1-2/año, amortizando inversión progresivamente.</w:t>
       </w:r>
     </w:p>
     <w:p>
@@ -3586,7 +3586,7 @@
           </w:tcPr>
           <w:p>
             <w:r>
-              <w:t>16.000 € usado / 380 €/mes</w:t>
+              <w:t>18.000-22.000 € usada con equipo de frío y certificado ATP (el plan financiero presupuesta 22.000 €)</w:t>
             </w:r>
           </w:p>
         </w:tc>

</xml_diff>